<commit_message>
P12 — perkakas diperiksa, versi dicatat
</commit_message>
<xml_diff>
--- a/12. Worksheet_PABW_Pertemuan12 - ID_v1.docx
+++ b/12. Worksheet_PABW_Pertemuan12 - ID_v1.docx
@@ -2522,10 +2522,7 @@
               <w:t>242</w:t>
             </w:r>
             <w:r>
-              <w:t xml:space="preserve"> </w:t>
-            </w:r>
-            <w:r>
-              <w:t>Baris</w:t>
+              <w:t xml:space="preserve"> Baris</w:t>
             </w:r>
           </w:p>
         </w:tc>
@@ -2596,10 +2593,7 @@
               <w:t>Base.css =</w:t>
             </w:r>
             <w:r>
-              <w:t xml:space="preserve"> 69 </w:t>
-            </w:r>
-            <w:r>
-              <w:t>Baris</w:t>
+              <w:t xml:space="preserve"> 69 Baris</w:t>
             </w:r>
           </w:p>
           <w:p>
@@ -2610,10 +2604,7 @@
               <w:t>Komponen.css =</w:t>
             </w:r>
             <w:r>
-              <w:t xml:space="preserve"> 302 </w:t>
-            </w:r>
-            <w:r>
-              <w:t>Baris</w:t>
+              <w:t xml:space="preserve"> 302 Baris</w:t>
             </w:r>
           </w:p>
           <w:p>
@@ -2624,10 +2615,7 @@
               <w:t>Layout.css =</w:t>
             </w:r>
             <w:r>
-              <w:t xml:space="preserve"> 137 </w:t>
-            </w:r>
-            <w:r>
-              <w:t>Baris</w:t>
+              <w:t xml:space="preserve"> 137 Baris</w:t>
             </w:r>
           </w:p>
           <w:p>
@@ -2644,32 +2632,23 @@
               <w:t>.css</w:t>
             </w:r>
             <w:r>
-              <w:t xml:space="preserve"> = 45 </w:t>
-            </w:r>
-            <w:r>
-              <w:t>Baris</w:t>
-            </w:r>
-          </w:p>
-          <w:p>
-            <w:pPr>
-              <w:spacing w:before="20" w:after="20" w:line="252" w:lineRule="auto"/>
-            </w:pPr>
-            <w:r>
-              <w:t xml:space="preserve">Tema.css = 70 </w:t>
-            </w:r>
-            <w:r>
-              <w:t>Baris</w:t>
-            </w:r>
-          </w:p>
-          <w:p>
-            <w:pPr>
-              <w:spacing w:before="20" w:after="20" w:line="252" w:lineRule="auto"/>
-            </w:pPr>
-            <w:r>
-              <w:t xml:space="preserve">Token.css = 66 </w:t>
-            </w:r>
-            <w:r>
-              <w:t>Baris</w:t>
+              <w:t xml:space="preserve"> = 45 Baris</w:t>
+            </w:r>
+          </w:p>
+          <w:p>
+            <w:pPr>
+              <w:spacing w:before="20" w:after="20" w:line="252" w:lineRule="auto"/>
+            </w:pPr>
+            <w:r>
+              <w:t>Tema.css = 70 Baris</w:t>
+            </w:r>
+          </w:p>
+          <w:p>
+            <w:pPr>
+              <w:spacing w:before="20" w:after="20" w:line="252" w:lineRule="auto"/>
+            </w:pPr>
+            <w:r>
+              <w:t>Token.css = 66 Baris</w:t>
             </w:r>
           </w:p>
         </w:tc>
@@ -2743,10 +2722,7 @@
               <w:t>Apps.js =</w:t>
             </w:r>
             <w:r>
-              <w:t xml:space="preserve"> 12 </w:t>
-            </w:r>
-            <w:r>
-              <w:t>Baris</w:t>
+              <w:t xml:space="preserve"> 12 Baris</w:t>
             </w:r>
           </w:p>
           <w:p>
@@ -2757,10 +2733,7 @@
               <w:t>Dom.js =</w:t>
             </w:r>
             <w:r>
-              <w:t xml:space="preserve"> 170 </w:t>
-            </w:r>
-            <w:r>
-              <w:t>Baris</w:t>
+              <w:t xml:space="preserve"> 170 Baris</w:t>
             </w:r>
           </w:p>
         </w:tc>
@@ -2831,10 +2804,7 @@
               <w:t>Data.js =</w:t>
             </w:r>
             <w:r>
-              <w:t xml:space="preserve"> 75 </w:t>
-            </w:r>
-            <w:r>
-              <w:t>Baris</w:t>
+              <w:t xml:space="preserve"> 75 Baris</w:t>
             </w:r>
           </w:p>
           <w:p>
@@ -2845,10 +2815,7 @@
               <w:t>State.js =</w:t>
             </w:r>
             <w:r>
-              <w:t xml:space="preserve"> 20 </w:t>
-            </w:r>
-            <w:r>
-              <w:t>Baris</w:t>
+              <w:t xml:space="preserve"> 20 Baris</w:t>
             </w:r>
           </w:p>
           <w:p>
@@ -2859,10 +2826,7 @@
               <w:t>Events.js =</w:t>
             </w:r>
             <w:r>
-              <w:t xml:space="preserve"> 71 </w:t>
-            </w:r>
-            <w:r>
-              <w:t>Baris</w:t>
+              <w:t xml:space="preserve"> 71 Baris</w:t>
             </w:r>
           </w:p>
         </w:tc>
@@ -3129,6 +3093,21 @@
             <w:pPr>
               <w:spacing w:before="20" w:after="20" w:line="252" w:lineRule="auto"/>
             </w:pPr>
+            <w:proofErr w:type="spellStart"/>
+            <w:proofErr w:type="gramStart"/>
+            <w:r>
+              <w:t>Ada,masih</w:t>
+            </w:r>
+            <w:proofErr w:type="spellEnd"/>
+            <w:proofErr w:type="gramEnd"/>
+            <w:r>
+              <w:t xml:space="preserve"> </w:t>
+            </w:r>
+            <w:proofErr w:type="spellStart"/>
+            <w:r>
+              <w:t>kosong</w:t>
+            </w:r>
+            <w:proofErr w:type="spellEnd"/>
           </w:p>
         </w:tc>
       </w:tr>
@@ -3198,6 +3177,14 @@
             <w:pPr>
               <w:spacing w:before="20" w:after="20" w:line="252" w:lineRule="auto"/>
             </w:pPr>
+            <w:r>
+              <w:t xml:space="preserve">Tidak </w:t>
+            </w:r>
+            <w:proofErr w:type="spellStart"/>
+            <w:r>
+              <w:t>ada</w:t>
+            </w:r>
+            <w:proofErr w:type="spellEnd"/>
           </w:p>
         </w:tc>
       </w:tr>
@@ -3267,6 +3254,11 @@
             <w:pPr>
               <w:spacing w:before="20" w:after="20" w:line="252" w:lineRule="auto"/>
             </w:pPr>
+            <w:proofErr w:type="spellStart"/>
+            <w:r>
+              <w:t>Sudah</w:t>
+            </w:r>
+            <w:proofErr w:type="spellEnd"/>
           </w:p>
         </w:tc>
       </w:tr>

</xml_diff>